<commit_message>
Revert OneFlow to OrgFlow, Center Valley spelling, profile menu
- Restore the OrgFlow name across web, landing, backend, iOS and demo
  content; drop the brandLabel display shim; re-render the social card.
- American spelling: the showcase pantry is Center Valley (PDF/DOCX
  rebuilt). The importer still accepts the old Centre org name.
- samples-v3 re-indexes untouched showcase sources so the demo workspace
  picks up the new text.
- Top-right avatar opens a menu with Organization and Sign out.

Co-Authored-By: Claude Opus 5.5 <noreply@anthropic.com>
</commit_message>
<xml_diff>
--- a/demo-content/01_Google_Drive/Operations/Volunteer_Welcome_and_First_Shift.docx
+++ b/demo-content/01_Google_Drive/Operations/Volunteer_Welcome_and_First_Shift.docx
@@ -41,7 +41,7 @@
     </w:p>
     <w:p>
       <w:r>
-        <w:t>A first shift should not depend on which coordinator happens to be working that morning. Centre Valley Community Pantry is a fictional nonprofit created for an OrgFlow demonstration. This guide describes one consistent welcome experience so a new volunteer can find the right person, feel comfortable asking questions, and begin useful work safely. No real volunteers or households are represented.</w:t>
+        <w:t>A first shift should not depend on which coordinator happens to be working that morning. Center Valley Community Pantry is a fictional nonprofit created for an OrgFlow demonstration. This guide describes one consistent welcome experience so a new volunteer can find the right person, feel comfortable asking questions, and begin useful work safely. No real volunteers or households are represented.</w:t>
       </w:r>
     </w:p>
     <w:p>
@@ -235,7 +235,7 @@
       <w:pStyle w:val="Caption"/>
     </w:pPr>
     <w:r>
-      <w:t>CENTRE VALLEY COMMUNITY PANTRY  |  FICTIONAL ORGFLOW DEMONSTRATION</w:t>
+      <w:t>CENTER VALLEY COMMUNITY PANTRY  |  FICTIONAL ORGFLOW DEMONSTRATION</w:t>
     </w:r>
   </w:p>
 </w:ftr>

</xml_diff>